<commit_message>
SCRUM-11: Documento del estado del Arte
</commit_message>
<xml_diff>
--- a/Estado del Arte e Investigacion de Base para Sistema POS y IA Local.docx
+++ b/Estado del Arte e Investigacion de Base para Sistema POS y IA Local.docx
@@ -19,7 +19,27 @@
           <w:sz w:val="32"/>
           <w:szCs w:val="32"/>
         </w:rPr>
-        <w:t>Documento: Estado del Arte e Investigación de Base para Sistema POS + IA Local Integrada</w:t>
+        <w:t xml:space="preserve">Documento: Estado del Arte e Investigación de Base para Sistema POS </w:t>
+      </w:r>
+      <w:r>
+        <w:rPr>
+          <w:rFonts w:ascii="Arial" w:hAnsi="Arial" w:cs="Arial"/>
+          <w:b/>
+          <w:bCs/>
+          <w:sz w:val="32"/>
+          <w:szCs w:val="32"/>
+        </w:rPr>
+        <w:t>+</w:t>
+      </w:r>
+      <w:r>
+        <w:rPr>
+          <w:rFonts w:ascii="Arial" w:hAnsi="Arial" w:cs="Arial"/>
+          <w:b/>
+          <w:bCs/>
+          <w:sz w:val="32"/>
+          <w:szCs w:val="32"/>
+        </w:rPr>
+        <w:t xml:space="preserve"> IA Local Integrada</w:t>
       </w:r>
     </w:p>
     <w:p>
@@ -34,7 +54,7 @@
           <w:rFonts w:ascii="Arial" w:hAnsi="Arial" w:cs="Arial"/>
         </w:rPr>
         <w:pict w14:anchorId="2AEADD02">
-          <v:rect id="_x0000_i1055" style="width:0;height:1.5pt" o:hralign="center" o:hrstd="t" o:hr="t" fillcolor="#a0a0a0" stroked="f"/>
+          <v:rect id="_x0000_i1025" style="width:0;height:1.5pt" o:hralign="center" o:hrstd="t" o:hr="t" fillcolor="#a0a0a0" stroked="f"/>
         </w:pict>
       </w:r>
     </w:p>
@@ -100,7 +120,7 @@
           <w:rFonts w:ascii="Arial" w:hAnsi="Arial" w:cs="Arial"/>
         </w:rPr>
         <w:pict w14:anchorId="0F2D5545">
-          <v:rect id="_x0000_i1056" style="width:0;height:1.5pt" o:hralign="center" o:hrstd="t" o:hr="t" fillcolor="#a0a0a0" stroked="f"/>
+          <v:rect id="_x0000_i1026" style="width:0;height:1.5pt" o:hralign="center" o:hrstd="t" o:hr="t" fillcolor="#a0a0a0" stroked="f"/>
         </w:pict>
       </w:r>
     </w:p>
@@ -366,7 +386,7 @@
           <w:rFonts w:ascii="Arial" w:hAnsi="Arial" w:cs="Arial"/>
         </w:rPr>
         <w:pict w14:anchorId="592CECBD">
-          <v:rect id="_x0000_i1057" style="width:0;height:1.5pt" o:hralign="center" o:hrstd="t" o:hr="t" fillcolor="#a0a0a0" stroked="f"/>
+          <v:rect id="_x0000_i1027" style="width:0;height:1.5pt" o:hralign="center" o:hrstd="t" o:hr="t" fillcolor="#a0a0a0" stroked="f"/>
         </w:pict>
       </w:r>
     </w:p>
@@ -726,7 +746,7 @@
           <w:rFonts w:ascii="Arial" w:hAnsi="Arial" w:cs="Arial"/>
         </w:rPr>
         <w:pict w14:anchorId="2B83031A">
-          <v:rect id="_x0000_i1058" style="width:0;height:1.5pt" o:hralign="center" o:hrstd="t" o:hr="t" fillcolor="#a0a0a0" stroked="f"/>
+          <v:rect id="_x0000_i1028" style="width:0;height:1.5pt" o:hralign="center" o:hrstd="t" o:hr="t" fillcolor="#a0a0a0" stroked="f"/>
         </w:pict>
       </w:r>
     </w:p>
@@ -792,7 +812,19 @@
         <w:rPr>
           <w:rFonts w:ascii="Arial" w:hAnsi="Arial" w:cs="Arial"/>
         </w:rPr>
-        <w:t xml:space="preserve">: agentes conversacionales aplicados a tareas de venta directa. Su arquitectura modular y uso de </w:t>
+        <w:t xml:space="preserve">: </w:t>
+      </w:r>
+      <w:r>
+        <w:rPr>
+          <w:rFonts w:ascii="Arial" w:hAnsi="Arial" w:cs="Arial"/>
+        </w:rPr>
+        <w:t>A</w:t>
+      </w:r>
+      <w:r>
+        <w:rPr>
+          <w:rFonts w:ascii="Arial" w:hAnsi="Arial" w:cs="Arial"/>
+        </w:rPr>
+        <w:t xml:space="preserve">gentes conversacionales aplicados a tareas de venta directa. Su arquitectura modular y uso de </w:t>
       </w:r>
       <w:proofErr w:type="spellStart"/>
       <w:r>
@@ -834,21 +866,19 @@
         <w:rPr>
           <w:rFonts w:ascii="Arial" w:hAnsi="Arial" w:cs="Arial"/>
         </w:rPr>
-        <w:t xml:space="preserve">: </w:t>
-      </w:r>
-      <w:proofErr w:type="spellStart"/>
-      <w:r>
-        <w:rPr>
-          <w:rFonts w:ascii="Arial" w:hAnsi="Arial" w:cs="Arial"/>
-        </w:rPr>
-        <w:t>framework</w:t>
-      </w:r>
-      <w:proofErr w:type="spellEnd"/>
-      <w:r>
-        <w:rPr>
-          <w:rFonts w:ascii="Arial" w:hAnsi="Arial" w:cs="Arial"/>
-        </w:rPr>
-        <w:t xml:space="preserve"> para crear agentes personalizados, incluyendo lógica de razonamiento paso a paso o interacción con bases de datos.</w:t>
+        <w:t>:</w:t>
+      </w:r>
+      <w:r>
+        <w:rPr>
+          <w:rFonts w:ascii="Arial" w:hAnsi="Arial" w:cs="Arial"/>
+        </w:rPr>
+        <w:t xml:space="preserve"> F</w:t>
+      </w:r>
+      <w:r>
+        <w:rPr>
+          <w:rFonts w:ascii="Arial" w:hAnsi="Arial" w:cs="Arial"/>
+        </w:rPr>
+        <w:t>ramework para crear agentes personalizados, incluyendo lógica de razonamiento paso a paso o interacción con bases de datos.</w:t>
       </w:r>
     </w:p>
     <w:p>
@@ -877,7 +907,7 @@
           <w:rFonts w:ascii="Arial" w:hAnsi="Arial" w:cs="Arial"/>
         </w:rPr>
         <w:pict w14:anchorId="5C1ABA43">
-          <v:rect id="_x0000_i1059" style="width:0;height:1.5pt" o:hralign="center" o:hrstd="t" o:hr="t" fillcolor="#a0a0a0" stroked="f"/>
+          <v:rect id="_x0000_i1029" style="width:0;height:1.5pt" o:hralign="center" o:hrstd="t" o:hr="t" fillcolor="#a0a0a0" stroked="f"/>
         </w:pict>
       </w:r>
     </w:p>
@@ -2172,6 +2202,7 @@
   <w:style w:type="character" w:default="1" w:styleId="Fuentedeprrafopredeter">
     <w:name w:val="Default Paragraph Font"/>
     <w:uiPriority w:val="1"/>
+    <w:semiHidden/>
     <w:unhideWhenUsed/>
   </w:style>
   <w:style w:type="table" w:default="1" w:styleId="Tablanormal">

</xml_diff>